<commit_message>
Stunde 12 (reelle Zahlen, n-te Wurzel); Regeln: Lebensweltbezug, keine Buchverweise, binomische Formeln bekannt
Co-Authored-By: Claude Opus 5.5 <noreply@anthropic.com>
Claude-Session: https://claude.ai/code/session_018NqAyWwuMo5VXeQXBtFhyT
</commit_message>
<xml_diff>
--- a/reihen/01-wurzeln/00-reihenplanung.docx
+++ b/reihen/01-wurzeln/00-reihenplanung.docx
@@ -25,7 +25,7 @@
           <w:i/>
           <w:sz w:val="24"/>
         </w:rPr>
-        <w:t>Lambacher Schweizer 9 NRW, Kap. „Wurzeln“ · Beginn 02.09.2026 · Mi 45 min / Do 90 min</w:t>
+        <w:t>Unterrichtsvorhaben 1 · Beginn 02.09.2026 · Mi 45 min / Do 90 min</w:t>
       </w:r>
     </w:p>
     <w:p>
@@ -391,7 +391,7 @@
               <w:rPr>
                 <w:sz w:val="18"/>
               </w:rPr>
-              <w:t>Buch Kap. 1</w:t>
+              <w:t>Merkkasten</w:t>
             </w:r>
           </w:p>
         </w:tc>
@@ -491,7 +491,7 @@
               <w:rPr>
                 <w:sz w:val="18"/>
               </w:rPr>
-              <w:t>Buch Kap. 1</w:t>
+              <w:t>–</w:t>
             </w:r>
           </w:p>
         </w:tc>
@@ -591,7 +591,7 @@
               <w:rPr>
                 <w:sz w:val="18"/>
               </w:rPr>
-              <w:t>Buch Kap. 2</w:t>
+              <w:t>–</w:t>
             </w:r>
           </w:p>
         </w:tc>
@@ -791,7 +791,7 @@
               <w:rPr>
                 <w:sz w:val="18"/>
               </w:rPr>
-              <w:t>Buch Kap. 2</w:t>
+              <w:t>–</w:t>
             </w:r>
           </w:p>
         </w:tc>
@@ -891,7 +891,7 @@
               <w:rPr>
                 <w:sz w:val="18"/>
               </w:rPr>
-              <w:t>Buch Kap. 4</w:t>
+              <w:t>–</w:t>
             </w:r>
           </w:p>
         </w:tc>
@@ -991,7 +991,7 @@
               <w:rPr>
                 <w:sz w:val="18"/>
               </w:rPr>
-              <w:t>Buch Kap. 4</w:t>
+              <w:t>–</w:t>
             </w:r>
           </w:p>
         </w:tc>
@@ -1085,7 +1085,7 @@
               <w:rPr>
                 <w:sz w:val="18"/>
               </w:rPr>
-              <w:t>Buch Kap. 4</w:t>
+              <w:t>–</w:t>
             </w:r>
           </w:p>
         </w:tc>
@@ -1185,7 +1185,7 @@
               <w:rPr>
                 <w:sz w:val="18"/>
               </w:rPr>
-              <w:t>Buch Kap. 4</w:t>
+              <w:t>–</w:t>
             </w:r>
           </w:p>
         </w:tc>
@@ -1473,13 +1473,13 @@
                 <w:b/>
                 <w:sz w:val="18"/>
               </w:rPr>
-              <w:t>Reelle Zahlen und Radizieren</w:t>
+              <w:t>Warum hat ein DIN-A4-Blatt genau diese Maße? / Wie lang ist die Kante meines Minecraft-Würfels?</w:t>
             </w:r>
             <w:r>
               <w:rPr>
                 <w:sz w:val="18"/>
               </w:rPr>
-              <w:t>: Zahlbereiche ℕ ⊂ ℤ ⊂ ℚ ⊂ ℝ ordnen; Kubikwurzel (Würfel: Volumen → Kantenlänge), n-te Wurzel als Umkehrung des Potenzierens; irrationale Zahlen auf dem Zahlenstrahl.</w:t>
+              <w:t xml:space="preserve"> Teil 1: √2 als Seitenverhältnis von DIN-A-Papier, Zahlbereiche ℕ ⊂ ℤ ⊂ ℚ ⊂ ℝ. Teil 2: Kubikwurzel und n-te Wurzel als Umkehrung des Potenzierens (Minecraft, Follower-Wachstum, DIN A0).</w:t>
             </w:r>
           </w:p>
         </w:tc>
@@ -1492,7 +1492,7 @@
               <w:rPr>
                 <w:sz w:val="18"/>
               </w:rPr>
-              <w:t>Placemat (Zahlbereiche), Lerntempoduett</w:t>
+              <w:t>Think-Pair-Share, Placemat, Lerntempoduett</w:t>
             </w:r>
           </w:p>
         </w:tc>
@@ -1505,7 +1505,7 @@
               <w:rPr>
                 <w:sz w:val="18"/>
               </w:rPr>
-              <w:t>(2), (9), Arg-4, Ope-4</w:t>
+              <w:t>(2), (9), Arg-4, Ope-4, Mod-7</w:t>
             </w:r>
           </w:p>
         </w:tc>
@@ -1518,7 +1518,7 @@
               <w:rPr>
                 <w:sz w:val="18"/>
               </w:rPr>
-              <w:t>AB Zahlbereiche/Radizieren · Übungswebsite Teil 1</w:t>
+              <w:t>Entwurf + Material Stunde 12 (liegt bei)</w:t>
             </w:r>
           </w:p>
         </w:tc>
@@ -1579,7 +1579,20 @@
               <w:rPr>
                 <w:sz w:val="18"/>
               </w:rPr>
-              <w:t xml:space="preserve"> (für die KA): zusammenfassen, ausmultiplizieren, ausklammern, Klammerregeln; Brücke zu Wurzeltermen: √3 · (2 + √3).</w:t>
+              <w:t xml:space="preserve"> (für die KA): zusammenfassen, ausmultiplizieren, ausklammern, </w:t>
+            </w:r>
+            <w:r>
+              <w:rPr>
+                <w:b/>
+                <w:sz w:val="18"/>
+              </w:rPr>
+              <w:t>binomische Formeln</w:t>
+            </w:r>
+            <w:r>
+              <w:rPr>
+                <w:sz w:val="18"/>
+              </w:rPr>
+              <w:t>; Brücke zu Wurzeltermen: (2 + √3)², (√5 − 1)(√5 + 1).</w:t>
             </w:r>
           </w:p>
         </w:tc>
@@ -2146,7 +2159,21 @@
         <w:t>Terme</w:t>
       </w:r>
       <w:r>
-        <w:t>: Was genau wiederholt wird, richtet sich nach Klasse 8. Wenn die binomischen Formeln schon behandelt wurden, nehme ich sie mit auf.</w:t>
+        <w:t>: Wiederholung inkl. binomischer Formeln (aus Klasse 8 bekannt), verknüpft mit Wurzeltermen.</w:t>
+      </w:r>
+    </w:p>
+    <w:p>
+      <w:pPr>
+        <w:pStyle w:val="ListBullet"/>
+      </w:pPr>
+      <w:r>
+        <w:rPr>
+          <w:b/>
+        </w:rPr>
+        <w:t>Lebensweltbezug</w:t>
+      </w:r>
+      <w:r>
+        <w:t xml:space="preserve"> in jeder Stunde (DIN-A-Papier, Minecraft, Social Media …); das Lehrbuch wird nur ergänzend genutzt.</w:t>
       </w:r>
     </w:p>
     <w:sectPr>

</xml_diff>